<commit_message>
Add synthetic-control Rmd and outputs
Add an RMarkdown implementation of the weighted synthetic-control donor construction (Statistical_documentation_in_R/Control_group_construction/control_group_new.Rmd) that standardises trajectories row-wise, selects nearest non-EU donors, solves constrained convex weights, aggregates global donor weights, and writes control_group_output.xlsx. Add supporting files: control_group_output.xlsx, methodology_for_this.docx, data_filtered.xlsx, and a manuscript docx on weighted control construction. Update manuscript files (Online_appendix_corrected.docx, The_Brexit_Tuition_Shock.docx) and revise Statistical_documentation_in_R/main_results/.Rhistory with refactored analysis code (loan PV function, elasticity calculations, plotting, WDI merges and regressions).
</commit_message>
<xml_diff>
--- a/Manuscript/Online_appendix_corrected.docx
+++ b/Manuscript/Online_appendix_corrected.docx
@@ -29,19 +29,29 @@
       <w:pPr>
         <w:spacing w:after="120" w:line="360" w:lineRule="auto"/>
         <w:jc w:val="both"/>
+        <w:rPr>
+          <w:highlight w:val="yellow"/>
+        </w:rPr>
       </w:pPr>
       <w:r>
+        <w:rPr>
+          <w:highlight w:val="yellow"/>
+        </w:rPr>
         <w:t xml:space="preserve">To validate that treated EU origin markets are compared against structurally similar unaffected markets, we implement a trajectory-based nearest-neighbor matching procedure grounded exclusively in pre-Brexit application dynamics. For each country </w:t>
       </w:r>
       <m:oMath>
         <m:r>
           <w:rPr>
             <w:rFonts w:ascii="Cambria Math" w:hAnsi="Cambria Math"/>
+            <w:highlight w:val="yellow"/>
           </w:rPr>
           <m:t>c</m:t>
         </m:r>
       </m:oMath>
       <w:r>
+        <w:rPr>
+          <w:highlight w:val="yellow"/>
+        </w:rPr>
         <w:t>, we construct a vector of pre-period applications:</w:t>
       </w:r>
     </w:p>
@@ -49,6 +59,9 @@
       <w:pPr>
         <w:spacing w:before="120" w:after="120"/>
         <w:jc w:val="center"/>
+        <w:rPr>
+          <w:highlight w:val="yellow"/>
+        </w:rPr>
       </w:pPr>
       <m:oMathPara>
         <m:oMath>
@@ -57,6 +70,7 @@
               <m:ctrlPr>
                 <w:rPr>
                   <w:rFonts w:ascii="Cambria Math" w:hAnsi="Cambria Math"/>
+                  <w:highlight w:val="yellow"/>
                 </w:rPr>
               </m:ctrlPr>
             </m:sSubSupPr>
@@ -64,6 +78,7 @@
               <m:r>
                 <w:rPr>
                   <w:rFonts w:ascii="Cambria Math" w:hAnsi="Cambria Math"/>
+                  <w:highlight w:val="yellow"/>
                 </w:rPr>
                 <m:t>Y</m:t>
               </m:r>
@@ -72,6 +87,7 @@
               <m:r>
                 <w:rPr>
                   <w:rFonts w:ascii="Cambria Math" w:hAnsi="Cambria Math"/>
+                  <w:highlight w:val="yellow"/>
                 </w:rPr>
                 <m:t>c</m:t>
               </m:r>
@@ -80,6 +96,7 @@
               <m:r>
                 <w:rPr>
                   <w:rFonts w:ascii="Cambria Math" w:hAnsi="Cambria Math"/>
+                  <w:highlight w:val="yellow"/>
                 </w:rPr>
                 <m:t>pre</m:t>
               </m:r>
@@ -88,6 +105,7 @@
           <m:r>
             <w:rPr>
               <w:rFonts w:ascii="Cambria Math" w:hAnsi="Cambria Math"/>
+              <w:highlight w:val="yellow"/>
             </w:rPr>
             <m:t>=</m:t>
           </m:r>
@@ -96,6 +114,7 @@
               <m:ctrlPr>
                 <w:rPr>
                   <w:rFonts w:ascii="Cambria Math" w:hAnsi="Cambria Math"/>
+                  <w:highlight w:val="yellow"/>
                 </w:rPr>
               </m:ctrlPr>
             </m:dPr>
@@ -105,6 +124,7 @@
                   <m:ctrlPr>
                     <w:rPr>
                       <w:rFonts w:ascii="Cambria Math" w:hAnsi="Cambria Math"/>
+                      <w:highlight w:val="yellow"/>
                     </w:rPr>
                   </m:ctrlPr>
                 </m:sSubPr>
@@ -112,6 +132,7 @@
                   <m:r>
                     <w:rPr>
                       <w:rFonts w:ascii="Cambria Math" w:hAnsi="Cambria Math"/>
+                      <w:highlight w:val="yellow"/>
                     </w:rPr>
                     <m:t>App</m:t>
                   </m:r>
@@ -120,6 +141,7 @@
                   <m:r>
                     <w:rPr>
                       <w:rFonts w:ascii="Cambria Math" w:hAnsi="Cambria Math"/>
+                      <w:highlight w:val="yellow"/>
                     </w:rPr>
                     <m:t>c,2014</m:t>
                   </m:r>
@@ -128,6 +150,7 @@
               <m:r>
                 <w:rPr>
                   <w:rFonts w:ascii="Cambria Math" w:hAnsi="Cambria Math"/>
+                  <w:highlight w:val="yellow"/>
                 </w:rPr>
                 <m:t>,</m:t>
               </m:r>
@@ -136,6 +159,7 @@
                   <m:ctrlPr>
                     <w:rPr>
                       <w:rFonts w:ascii="Cambria Math" w:hAnsi="Cambria Math"/>
+                      <w:highlight w:val="yellow"/>
                     </w:rPr>
                   </m:ctrlPr>
                 </m:sSubPr>
@@ -143,6 +167,7 @@
                   <m:r>
                     <w:rPr>
                       <w:rFonts w:ascii="Cambria Math" w:hAnsi="Cambria Math"/>
+                      <w:highlight w:val="yellow"/>
                     </w:rPr>
                     <m:t>App</m:t>
                   </m:r>
@@ -151,6 +176,7 @@
                   <m:r>
                     <w:rPr>
                       <w:rFonts w:ascii="Cambria Math" w:hAnsi="Cambria Math"/>
+                      <w:highlight w:val="yellow"/>
                     </w:rPr>
                     <m:t>c,2015</m:t>
                   </m:r>
@@ -159,6 +185,7 @@
               <m:r>
                 <w:rPr>
                   <w:rFonts w:ascii="Cambria Math" w:hAnsi="Cambria Math"/>
+                  <w:highlight w:val="yellow"/>
                 </w:rPr>
                 <m:t xml:space="preserve">, …, </m:t>
               </m:r>
@@ -167,6 +194,7 @@
                   <m:ctrlPr>
                     <w:rPr>
                       <w:rFonts w:ascii="Cambria Math" w:hAnsi="Cambria Math"/>
+                      <w:highlight w:val="yellow"/>
                     </w:rPr>
                   </m:ctrlPr>
                 </m:sSubPr>
@@ -174,6 +202,7 @@
                   <m:r>
                     <w:rPr>
                       <w:rFonts w:ascii="Cambria Math" w:hAnsi="Cambria Math"/>
+                      <w:highlight w:val="yellow"/>
                     </w:rPr>
                     <m:t>App</m:t>
                   </m:r>
@@ -182,6 +211,7 @@
                   <m:r>
                     <w:rPr>
                       <w:rFonts w:ascii="Cambria Math" w:hAnsi="Cambria Math"/>
+                      <w:highlight w:val="yellow"/>
                     </w:rPr>
                     <m:t>c,2020</m:t>
                   </m:r>
@@ -196,8 +226,14 @@
       <w:pPr>
         <w:spacing w:after="120" w:line="360" w:lineRule="auto"/>
         <w:jc w:val="both"/>
+        <w:rPr>
+          <w:highlight w:val="yellow"/>
+        </w:rPr>
       </w:pPr>
       <w:r>
+        <w:rPr>
+          <w:highlight w:val="yellow"/>
+        </w:rPr>
         <w:t>We normalize trajectories by log-scaling and z-standardization to emphasize pattern similarity rather than size differences:</w:t>
       </w:r>
     </w:p>
@@ -205,6 +241,9 @@
       <w:pPr>
         <w:spacing w:before="120" w:after="120"/>
         <w:jc w:val="center"/>
+        <w:rPr>
+          <w:highlight w:val="yellow"/>
+        </w:rPr>
       </w:pPr>
       <m:oMathPara>
         <m:oMath>
@@ -213,6 +252,7 @@
               <m:ctrlPr>
                 <w:rPr>
                   <w:rFonts w:ascii="Cambria Math" w:hAnsi="Cambria Math"/>
+                  <w:highlight w:val="yellow"/>
                 </w:rPr>
               </m:ctrlPr>
             </m:sSubPr>
@@ -220,6 +260,7 @@
               <m:r>
                 <w:rPr>
                   <w:rFonts w:ascii="Cambria Math" w:hAnsi="Cambria Math"/>
+                  <w:highlight w:val="yellow"/>
                 </w:rPr>
                 <m:t>Y</m:t>
               </m:r>
@@ -228,6 +269,7 @@
               <m:r>
                 <w:rPr>
                   <w:rFonts w:ascii="Cambria Math" w:hAnsi="Cambria Math"/>
+                  <w:highlight w:val="yellow"/>
                 </w:rPr>
                 <m:t>c,t</m:t>
               </m:r>
@@ -236,6 +278,7 @@
           <m:r>
             <w:rPr>
               <w:rFonts w:ascii="Cambria Math" w:hAnsi="Cambria Math"/>
+              <w:highlight w:val="yellow"/>
             </w:rPr>
             <m:t>=</m:t>
           </m:r>
@@ -244,6 +287,7 @@
               <m:ctrlPr>
                 <w:rPr>
                   <w:rFonts w:ascii="Cambria Math" w:hAnsi="Cambria Math"/>
+                  <w:highlight w:val="yellow"/>
                 </w:rPr>
               </m:ctrlPr>
             </m:fPr>
@@ -253,6 +297,7 @@
                   <m:ctrlPr>
                     <w:rPr>
                       <w:rFonts w:ascii="Cambria Math" w:hAnsi="Cambria Math"/>
+                      <w:highlight w:val="yellow"/>
                     </w:rPr>
                   </m:ctrlPr>
                 </m:funcPr>
@@ -260,6 +305,7 @@
                   <m:r>
                     <w:rPr>
                       <w:rFonts w:ascii="Cambria Math" w:hAnsi="Cambria Math"/>
+                      <w:highlight w:val="yellow"/>
                     </w:rPr>
                     <m:t>log</m:t>
                   </m:r>
@@ -270,6 +316,7 @@
                       <m:ctrlPr>
                         <w:rPr>
                           <w:rFonts w:ascii="Cambria Math" w:hAnsi="Cambria Math"/>
+                          <w:highlight w:val="yellow"/>
                         </w:rPr>
                       </m:ctrlPr>
                     </m:sSubPr>
@@ -277,20 +324,16 @@
                       <m:r>
                         <w:rPr>
                           <w:rFonts w:ascii="Cambria Math" w:hAnsi="Cambria Math"/>
+                          <w:highlight w:val="yellow"/>
                         </w:rPr>
-                        <m:t>(</m:t>
-                      </m:r>
-                      <m:r>
-                        <w:rPr>
-                          <w:rFonts w:ascii="Cambria Math" w:hAnsi="Cambria Math"/>
-                        </w:rPr>
-                        <m:t>App</m:t>
+                        <m:t>(App</m:t>
                       </m:r>
                     </m:e>
                     <m:sub>
                       <m:r>
                         <w:rPr>
                           <w:rFonts w:ascii="Cambria Math" w:hAnsi="Cambria Math"/>
+                          <w:highlight w:val="yellow"/>
                         </w:rPr>
                         <m:t>c,t</m:t>
                       </m:r>
@@ -299,6 +342,7 @@
                   <m:r>
                     <w:rPr>
                       <w:rFonts w:ascii="Cambria Math" w:hAnsi="Cambria Math"/>
+                      <w:highlight w:val="yellow"/>
                     </w:rPr>
                     <m:t>+1</m:t>
                   </m:r>
@@ -307,20 +351,16 @@
               <m:r>
                 <w:rPr>
                   <w:rFonts w:ascii="Cambria Math" w:hAnsi="Cambria Math"/>
+                  <w:highlight w:val="yellow"/>
                 </w:rPr>
-                <m:t>)</m:t>
-              </m:r>
-              <m:r>
-                <w:rPr>
-                  <w:rFonts w:ascii="Cambria Math" w:hAnsi="Cambria Math"/>
-                </w:rPr>
-                <m:t>-</m:t>
+                <m:t>)-</m:t>
               </m:r>
               <m:sSub>
                 <m:sSubPr>
                   <m:ctrlPr>
                     <w:rPr>
                       <w:rFonts w:ascii="Cambria Math" w:hAnsi="Cambria Math"/>
+                      <w:highlight w:val="yellow"/>
                     </w:rPr>
                   </m:ctrlPr>
                 </m:sSubPr>
@@ -328,6 +368,7 @@
                   <m:r>
                     <w:rPr>
                       <w:rFonts w:ascii="Cambria Math" w:hAnsi="Cambria Math"/>
+                      <w:highlight w:val="yellow"/>
                     </w:rPr>
                     <m:t>μ</m:t>
                   </m:r>
@@ -336,6 +377,7 @@
                   <m:r>
                     <w:rPr>
                       <w:rFonts w:ascii="Cambria Math" w:hAnsi="Cambria Math"/>
+                      <w:highlight w:val="yellow"/>
                     </w:rPr>
                     <m:t>c</m:t>
                   </m:r>
@@ -348,6 +390,7 @@
                   <m:ctrlPr>
                     <w:rPr>
                       <w:rFonts w:ascii="Cambria Math" w:hAnsi="Cambria Math"/>
+                      <w:highlight w:val="yellow"/>
                     </w:rPr>
                   </m:ctrlPr>
                 </m:sSubPr>
@@ -355,6 +398,7 @@
                   <m:r>
                     <w:rPr>
                       <w:rFonts w:ascii="Cambria Math" w:hAnsi="Cambria Math"/>
+                      <w:highlight w:val="yellow"/>
                     </w:rPr>
                     <m:t>σ</m:t>
                   </m:r>
@@ -363,6 +407,7 @@
                   <m:r>
                     <w:rPr>
                       <w:rFonts w:ascii="Cambria Math" w:hAnsi="Cambria Math"/>
+                      <w:highlight w:val="yellow"/>
                     </w:rPr>
                     <m:t>c</m:t>
                   </m:r>
@@ -377,8 +422,14 @@
       <w:pPr>
         <w:spacing w:after="120" w:line="360" w:lineRule="auto"/>
         <w:jc w:val="both"/>
+        <w:rPr>
+          <w:highlight w:val="yellow"/>
+        </w:rPr>
       </w:pPr>
       <w:r>
+        <w:rPr>
+          <w:highlight w:val="yellow"/>
+        </w:rPr>
         <w:t xml:space="preserve">where </w:t>
       </w:r>
       <m:oMath>
@@ -387,6 +438,7 @@
             <m:ctrlPr>
               <w:rPr>
                 <w:rFonts w:ascii="Cambria Math" w:hAnsi="Cambria Math"/>
+                <w:highlight w:val="yellow"/>
               </w:rPr>
             </m:ctrlPr>
           </m:sSubPr>
@@ -394,6 +446,7 @@
             <m:r>
               <w:rPr>
                 <w:rFonts w:ascii="Cambria Math" w:hAnsi="Cambria Math"/>
+                <w:highlight w:val="yellow"/>
               </w:rPr>
               <m:t>μ</m:t>
             </m:r>
@@ -402,6 +455,7 @@
             <m:r>
               <w:rPr>
                 <w:rFonts w:ascii="Cambria Math" w:hAnsi="Cambria Math"/>
+                <w:highlight w:val="yellow"/>
               </w:rPr>
               <m:t>c</m:t>
             </m:r>
@@ -409,6 +463,9 @@
         </m:sSub>
       </m:oMath>
       <w:r>
+        <w:rPr>
+          <w:highlight w:val="yellow"/>
+        </w:rPr>
         <w:t xml:space="preserve"> and </w:t>
       </w:r>
       <m:oMath>
@@ -417,6 +474,7 @@
             <m:ctrlPr>
               <w:rPr>
                 <w:rFonts w:ascii="Cambria Math" w:hAnsi="Cambria Math"/>
+                <w:highlight w:val="yellow"/>
               </w:rPr>
             </m:ctrlPr>
           </m:sSubPr>
@@ -424,6 +482,7 @@
             <m:r>
               <w:rPr>
                 <w:rFonts w:ascii="Cambria Math" w:hAnsi="Cambria Math"/>
+                <w:highlight w:val="yellow"/>
               </w:rPr>
               <m:t>σ</m:t>
             </m:r>
@@ -432,6 +491,7 @@
             <m:r>
               <w:rPr>
                 <w:rFonts w:ascii="Cambria Math" w:hAnsi="Cambria Math"/>
+                <w:highlight w:val="yellow"/>
               </w:rPr>
               <m:t>c</m:t>
             </m:r>
@@ -439,6 +499,9 @@
         </m:sSub>
       </m:oMath>
       <w:r>
+        <w:rPr>
+          <w:highlight w:val="yellow"/>
+        </w:rPr>
         <w:t xml:space="preserve"> are, respectively, the mean and standard deviation in the pre-period. This transformation produces a scale-invariant representation consistent with best practices in time-series similarity modeling (Montero-Manso &amp; Hyndman, 2021). We then compute pairwise Euclidean distances between standardized pre-trend paths:</w:t>
       </w:r>
     </w:p>
@@ -446,6 +509,9 @@
       <w:pPr>
         <w:spacing w:before="120" w:after="120"/>
         <w:jc w:val="center"/>
+        <w:rPr>
+          <w:highlight w:val="yellow"/>
+        </w:rPr>
       </w:pPr>
       <m:oMathPara>
         <m:oMath>
@@ -454,6 +520,7 @@
               <m:ctrlPr>
                 <w:rPr>
                   <w:rFonts w:ascii="Cambria Math" w:hAnsi="Cambria Math"/>
+                  <w:highlight w:val="yellow"/>
                 </w:rPr>
               </m:ctrlPr>
             </m:sSubPr>
@@ -461,6 +528,7 @@
               <m:r>
                 <w:rPr>
                   <w:rFonts w:ascii="Cambria Math" w:hAnsi="Cambria Math"/>
+                  <w:highlight w:val="yellow"/>
                 </w:rPr>
                 <m:t>d</m:t>
               </m:r>
@@ -469,6 +537,7 @@
               <m:r>
                 <w:rPr>
                   <w:rFonts w:ascii="Cambria Math" w:hAnsi="Cambria Math"/>
+                  <w:highlight w:val="yellow"/>
                 </w:rPr>
                 <m:t>j,k</m:t>
               </m:r>
@@ -477,6 +546,7 @@
           <m:r>
             <w:rPr>
               <w:rFonts w:ascii="Cambria Math" w:hAnsi="Cambria Math"/>
+              <w:highlight w:val="yellow"/>
             </w:rPr>
             <m:t>=</m:t>
           </m:r>
@@ -486,6 +556,7 @@
               <m:ctrlPr>
                 <w:rPr>
                   <w:rFonts w:ascii="Cambria Math" w:hAnsi="Cambria Math"/>
+                  <w:highlight w:val="yellow"/>
                 </w:rPr>
               </m:ctrlPr>
             </m:radPr>
@@ -498,6 +569,7 @@
                   <m:ctrlPr>
                     <w:rPr>
                       <w:rFonts w:ascii="Cambria Math" w:hAnsi="Cambria Math"/>
+                      <w:highlight w:val="yellow"/>
                     </w:rPr>
                   </m:ctrlPr>
                 </m:naryPr>
@@ -505,6 +577,7 @@
                   <m:r>
                     <w:rPr>
                       <w:rFonts w:ascii="Cambria Math" w:hAnsi="Cambria Math"/>
+                      <w:highlight w:val="yellow"/>
                     </w:rPr>
                     <m:t>t≤2020</m:t>
                   </m:r>
@@ -513,6 +586,7 @@
                   <m:r>
                     <w:rPr>
                       <w:rFonts w:ascii="Cambria Math" w:hAnsi="Cambria Math"/>
+                      <w:highlight w:val="yellow"/>
                     </w:rPr>
                     <m:t xml:space="preserve"> </m:t>
                   </m:r>
@@ -523,6 +597,7 @@
                       <m:ctrlPr>
                         <w:rPr>
                           <w:rFonts w:ascii="Cambria Math" w:hAnsi="Cambria Math"/>
+                          <w:highlight w:val="yellow"/>
                         </w:rPr>
                       </m:ctrlPr>
                     </m:sSupPr>
@@ -532,6 +607,7 @@
                           <m:ctrlPr>
                             <w:rPr>
                               <w:rFonts w:ascii="Cambria Math" w:hAnsi="Cambria Math"/>
+                              <w:highlight w:val="yellow"/>
                             </w:rPr>
                           </m:ctrlPr>
                         </m:dPr>
@@ -541,6 +617,7 @@
                               <m:ctrlPr>
                                 <w:rPr>
                                   <w:rFonts w:ascii="Cambria Math" w:hAnsi="Cambria Math"/>
+                                  <w:highlight w:val="yellow"/>
                                 </w:rPr>
                               </m:ctrlPr>
                             </m:sSubPr>
@@ -548,6 +625,7 @@
                               <m:r>
                                 <w:rPr>
                                   <w:rFonts w:ascii="Cambria Math" w:hAnsi="Cambria Math"/>
+                                  <w:highlight w:val="yellow"/>
                                 </w:rPr>
                                 <m:t>Y</m:t>
                               </m:r>
@@ -556,6 +634,7 @@
                               <m:r>
                                 <w:rPr>
                                   <w:rFonts w:ascii="Cambria Math" w:hAnsi="Cambria Math"/>
+                                  <w:highlight w:val="yellow"/>
                                 </w:rPr>
                                 <m:t>j,t</m:t>
                               </m:r>
@@ -564,6 +643,7 @@
                           <m:r>
                             <w:rPr>
                               <w:rFonts w:ascii="Cambria Math" w:hAnsi="Cambria Math"/>
+                              <w:highlight w:val="yellow"/>
                             </w:rPr>
                             <m:t>-</m:t>
                           </m:r>
@@ -572,6 +652,7 @@
                               <m:ctrlPr>
                                 <w:rPr>
                                   <w:rFonts w:ascii="Cambria Math" w:hAnsi="Cambria Math"/>
+                                  <w:highlight w:val="yellow"/>
                                 </w:rPr>
                               </m:ctrlPr>
                             </m:sSubPr>
@@ -579,6 +660,7 @@
                               <m:r>
                                 <w:rPr>
                                   <w:rFonts w:ascii="Cambria Math" w:hAnsi="Cambria Math"/>
+                                  <w:highlight w:val="yellow"/>
                                 </w:rPr>
                                 <m:t>Y</m:t>
                               </m:r>
@@ -587,6 +669,7 @@
                               <m:r>
                                 <w:rPr>
                                   <w:rFonts w:ascii="Cambria Math" w:hAnsi="Cambria Math"/>
+                                  <w:highlight w:val="yellow"/>
                                 </w:rPr>
                                 <m:t>k,t</m:t>
                               </m:r>
@@ -599,6 +682,7 @@
                       <m:r>
                         <w:rPr>
                           <w:rFonts w:ascii="Cambria Math" w:hAnsi="Cambria Math"/>
+                          <w:highlight w:val="yellow"/>
                         </w:rPr>
                         <m:t>2</m:t>
                       </m:r>
@@ -615,19 +699,29 @@
       <w:pPr>
         <w:spacing w:after="120" w:line="360" w:lineRule="auto"/>
         <w:jc w:val="both"/>
+        <w:rPr>
+          <w:highlight w:val="yellow"/>
+        </w:rPr>
       </w:pPr>
       <w:r>
+        <w:rPr>
+          <w:highlight w:val="yellow"/>
+        </w:rPr>
         <w:t xml:space="preserve">For each EU origin market </w:t>
       </w:r>
       <m:oMath>
         <m:r>
           <w:rPr>
             <w:rFonts w:ascii="Cambria Math" w:hAnsi="Cambria Math"/>
+            <w:highlight w:val="yellow"/>
           </w:rPr>
           <m:t>j</m:t>
         </m:r>
       </m:oMath>
       <w:r>
+        <w:rPr>
+          <w:highlight w:val="yellow"/>
+        </w:rPr>
         <w:t>, we select the three non-EU origins with the minimum trajectory distance:</w:t>
       </w:r>
     </w:p>
@@ -635,6 +729,9 @@
       <w:pPr>
         <w:spacing w:before="120" w:after="120"/>
         <w:jc w:val="center"/>
+        <w:rPr>
+          <w:highlight w:val="yellow"/>
+        </w:rPr>
       </w:pPr>
       <m:oMathPara>
         <m:oMath>
@@ -643,6 +740,7 @@
               <m:ctrlPr>
                 <w:rPr>
                   <w:rFonts w:ascii="Cambria Math" w:hAnsi="Cambria Math"/>
+                  <w:highlight w:val="yellow"/>
                 </w:rPr>
               </m:ctrlPr>
             </m:sSubPr>
@@ -650,6 +748,7 @@
               <m:r>
                 <w:rPr>
                   <w:rFonts w:ascii="Cambria Math" w:hAnsi="Cambria Math"/>
+                  <w:highlight w:val="yellow"/>
                 </w:rPr>
                 <m:t>Γ</m:t>
               </m:r>
@@ -658,6 +757,7 @@
               <m:r>
                 <w:rPr>
                   <w:rFonts w:ascii="Cambria Math" w:hAnsi="Cambria Math"/>
+                  <w:highlight w:val="yellow"/>
                 </w:rPr>
                 <m:t>j</m:t>
               </m:r>
@@ -666,6 +766,7 @@
           <m:r>
             <w:rPr>
               <w:rFonts w:ascii="Cambria Math" w:hAnsi="Cambria Math"/>
+              <w:highlight w:val="yellow"/>
             </w:rPr>
             <m:t>=</m:t>
           </m:r>
@@ -674,6 +775,7 @@
               <m:ctrlPr>
                 <w:rPr>
                   <w:rFonts w:ascii="Cambria Math" w:hAnsi="Cambria Math"/>
+                  <w:highlight w:val="yellow"/>
                 </w:rPr>
               </m:ctrlPr>
             </m:sSubPr>
@@ -681,6 +783,7 @@
               <m:r>
                 <w:rPr>
                   <w:rFonts w:ascii="Cambria Math" w:hAnsi="Cambria Math"/>
+                  <w:highlight w:val="yellow"/>
                 </w:rPr>
                 <m:t>argmin</m:t>
               </m:r>
@@ -689,6 +792,7 @@
               <m:r>
                 <w:rPr>
                   <w:rFonts w:ascii="Cambria Math" w:hAnsi="Cambria Math"/>
+                  <w:highlight w:val="yellow"/>
                 </w:rPr>
                 <m:t>k∉</m:t>
               </m:r>
@@ -697,6 +801,7 @@
                   <m:ctrlPr>
                     <w:rPr>
                       <w:rFonts w:ascii="Cambria Math" w:hAnsi="Cambria Math"/>
+                      <w:highlight w:val="yellow"/>
                     </w:rPr>
                   </m:ctrlPr>
                 </m:sSubPr>
@@ -704,6 +809,7 @@
                   <m:r>
                     <w:rPr>
                       <w:rFonts w:ascii="Cambria Math" w:hAnsi="Cambria Math"/>
+                      <w:highlight w:val="yellow"/>
                     </w:rPr>
                     <m:t>Γ</m:t>
                   </m:r>
@@ -712,6 +818,7 @@
                   <m:r>
                     <w:rPr>
                       <w:rFonts w:ascii="Cambria Math" w:hAnsi="Cambria Math"/>
+                      <w:highlight w:val="yellow"/>
                     </w:rPr>
                     <m:t>j</m:t>
                   </m:r>
@@ -722,6 +829,7 @@
           <m:r>
             <w:rPr>
               <w:rFonts w:ascii="Cambria Math" w:hAnsi="Cambria Math"/>
+              <w:highlight w:val="yellow"/>
             </w:rPr>
             <m:t xml:space="preserve"> </m:t>
           </m:r>
@@ -730,6 +838,7 @@
               <m:ctrlPr>
                 <w:rPr>
                   <w:rFonts w:ascii="Cambria Math" w:hAnsi="Cambria Math"/>
+                  <w:highlight w:val="yellow"/>
                 </w:rPr>
               </m:ctrlPr>
             </m:sSubPr>
@@ -737,6 +846,7 @@
               <m:r>
                 <w:rPr>
                   <w:rFonts w:ascii="Cambria Math" w:hAnsi="Cambria Math"/>
+                  <w:highlight w:val="yellow"/>
                 </w:rPr>
                 <m:t>d</m:t>
               </m:r>
@@ -745,6 +855,7 @@
               <m:r>
                 <w:rPr>
                   <w:rFonts w:ascii="Cambria Math" w:hAnsi="Cambria Math"/>
+                  <w:highlight w:val="yellow"/>
                 </w:rPr>
                 <m:t>j,k</m:t>
               </m:r>
@@ -753,6 +864,7 @@
           <m:r>
             <w:rPr>
               <w:rFonts w:ascii="Cambria Math" w:hAnsi="Cambria Math"/>
+              <w:highlight w:val="yellow"/>
             </w:rPr>
             <m:t>  </m:t>
           </m:r>
@@ -763,6 +875,7 @@
               <m:ctrlPr>
                 <w:rPr>
                   <w:rFonts w:ascii="Cambria Math" w:hAnsi="Cambria Math"/>
+                  <w:highlight w:val="yellow"/>
                 </w:rPr>
               </m:ctrlPr>
             </m:dPr>
@@ -772,6 +885,7 @@
                   <m:ctrlPr>
                     <w:rPr>
                       <w:rFonts w:ascii="Cambria Math" w:hAnsi="Cambria Math"/>
+                      <w:highlight w:val="yellow"/>
                     </w:rPr>
                   </m:ctrlPr>
                 </m:sSubPr>
@@ -779,6 +893,7 @@
                   <m:r>
                     <w:rPr>
                       <w:rFonts w:ascii="Cambria Math" w:hAnsi="Cambria Math"/>
+                      <w:highlight w:val="yellow"/>
                     </w:rPr>
                     <m:t>Γ</m:t>
                   </m:r>
@@ -787,6 +902,7 @@
                   <m:r>
                     <w:rPr>
                       <w:rFonts w:ascii="Cambria Math" w:hAnsi="Cambria Math"/>
+                      <w:highlight w:val="yellow"/>
                     </w:rPr>
                     <m:t>j</m:t>
                   </m:r>
@@ -795,6 +911,7 @@
               <m:r>
                 <w:rPr>
                   <w:rFonts w:ascii="Cambria Math" w:hAnsi="Cambria Math"/>
+                  <w:highlight w:val="yellow"/>
                 </w:rPr>
                 <m:t>=3</m:t>
               </m:r>
@@ -809,24 +926,41 @@
         <w:jc w:val="both"/>
       </w:pPr>
       <w:r>
+        <w:rPr>
+          <w:highlight w:val="yellow"/>
+        </w:rPr>
         <w:t xml:space="preserve">This design follows established matching-based causal inference methodology (Rosenbaum &amp; Rubin, 1985; Stuart, 2010), ensuring that counterfactual comparisons rely on units exhibiting the closest pre-shock behavior rather than arbitrary geographic or economic similarity. The approach satisfies the key </w:t>
       </w:r>
       <w:proofErr w:type="spellStart"/>
       <w:r>
+        <w:rPr>
+          <w:highlight w:val="yellow"/>
+        </w:rPr>
         <w:t>DiD</w:t>
       </w:r>
       <w:proofErr w:type="spellEnd"/>
       <w:r>
+        <w:rPr>
+          <w:highlight w:val="yellow"/>
+        </w:rPr>
         <w:t xml:space="preserve"> requirement of parallel pre-treatment trends for valid causal identification (Abadie &amp; </w:t>
       </w:r>
       <w:proofErr w:type="spellStart"/>
       <w:r>
+        <w:rPr>
+          <w:highlight w:val="yellow"/>
+        </w:rPr>
         <w:t>Cattaneo</w:t>
       </w:r>
       <w:proofErr w:type="spellEnd"/>
       <w:r>
+        <w:rPr>
+          <w:highlight w:val="yellow"/>
+        </w:rPr>
         <w:t>, 2018; Imai &amp; Kim, 2020). We then jointly visualize the full 2014–2024 trajectories of each EU market and its matched donor set. The resulting matched-panel plots show tight pre-2021 alignment and a sharp post-2021 divergence that coincides with the introduction of international fee status for EU applicants — consistent with an exogenous tuition-induced demand shock.</w:t>
       </w:r>
+      <w:bookmarkStart w:id="0" w:name="_GoBack"/>
+      <w:bookmarkEnd w:id="0"/>
     </w:p>
     <w:tbl>
       <w:tblPr>
@@ -28519,8 +28653,6 @@
       <w:pPr>
         <w:spacing w:before="360" w:after="180"/>
       </w:pPr>
-      <w:bookmarkStart w:id="0" w:name="_GoBack"/>
-      <w:bookmarkEnd w:id="0"/>
       <w:r>
         <w:rPr>
           <w:b/>

</xml_diff>